<commit_message>
spec(baltic): revise design after 3-reviewer in-loop review (premise correction)
Applied science + config-integrity + feasibility reviews. Key correction: the
'cod too high, releasing prey' premise is FALSE — baseline cod is already ~64 kt
in-envelope (the 150 kt figure is seeding, not equilibrium) and forage prey are
already in-envelope, so cod-level-forcing and seal-on-forage target non-existent
gaps. Re-centred on the real, citable leverage: percid/smelt missing-removals
(primary) + optional cod persistence. Added a mandatory cheap feasibility gate
before the 4-8h recal; honest bar (perch closable, pikeperch ~90x likely not);
fixed all config bindings (sp14/sp15 indices, byYear headerless-column file format
+ horizon padding, apply_calibration routing, allowlist, cod fsh0 removal,
necessary cormorant matrix column). DOCX summary redesign section updated to match.

Co-Authored-By: Claude Opus 4.8 <noreply@anthropic.com>
</commit_message>
<xml_diff>
--- a/docs/baltic_findings_summary_2026-07-28.docx
+++ b/docs/baltic_findings_summary_2026-07-28.docx
@@ -60,7 +60,7 @@
         <w:pStyle w:val="ListBullet"/>
       </w:pPr>
       <w:r>
-        <w:t>A fishing-forced redesign is both engine-feasible and scientifically grounded: drive cod down its real ICES decline via per-year FISHING forcing (not biomass forcing, which the engine does not support for a multi-year trajectory), while calibrating seal/cormorant top-down control and realistic percid removals to hold the prey field. Because cod stays a live focal predator, this avoids the apex-predator-release trap that sank the disaggregation.</w:t>
+        <w:t>A redesign (spec 2026-07-28) targets these gaps. NOTE (post-review correction): the aggregate baseline's cod is ALREADY in-envelope (~64 kt with the RV gate on; the ~150 kt figure is seeding, not equilibrium) and the forage prey are already in-envelope — so 'lowering cod' and 'seals holding forage fish' target gaps that do not exist. The genuine, citable leverage is the percid/smelt missing-removals; cod's real issue is persistence (dips to 2.4 kt), not level. The redesign is re-centred accordingly (see §5).</w:t>
       </w:r>
     </w:p>
     <w:p>
@@ -629,12 +629,12 @@
         <w:pStyle w:val="Heading1"/>
       </w:pPr>
       <w:r>
-        <w:t>5  The fishing-forced redesign</w:t>
+        <w:t>5  The redesign (re-centred after a 3-reviewer in-loop review)</w:t>
       </w:r>
     </w:p>
     <w:p>
       <w:r>
-        <w:t>Building on the aggregate-cod 5/8 baseline (not the failed disaggregation):</w:t>
+        <w:t>A three-reviewer review (science, config-integrity, feasibility) corrected the original 'fishing-forced cod' framing. On the aggregate baseline, cod is already ~64 kt (in-envelope) and the forage prey (herring/sprat/flounder) are already in-envelope, so forcing cod lower and adding seals to hold forage fish address non-existent gaps. The verified baseline gaps are the percids/smelt and cod non-persistence. The re-centred design (spec docs/superpowers/specs/2026-07-28-baltic-fishing-forced-cod-topdown-control-design.md):</w:t>
       </w:r>
     </w:p>
     <w:p>
@@ -642,7 +642,7 @@
         <w:pStyle w:val="ListBullet"/>
       </w:pPr>
       <w:r>
-        <w:t>Drive cod down its real ICES decline via per-year FISHING forcing (mortality.fishing.catches.byYear from the ICES cod catch history), keeping cod a live focal predator so the food web stays intact and the apex-predator-release trap is avoided.</w:t>
+        <w:t>PRIMARY: reduce the percid/smelt overshoot with grounded missing removals — realistic absolute percid fishing F (~0.3–0.6, recreational + coastal; §3.2) plus cormorant predation (§3.3, ~2× the fishery for perch). Honest limit: perch (~2×) is plausibly closable; pikeperch (~90×) is likely NOT — cormorants reach only juvenile pikeperch and a ~90× gap signals missing coarse-grid habitat regulation.</w:t>
       </w:r>
     </w:p>
     <w:p>
@@ -650,7 +650,7 @@
         <w:pStyle w:val="ListBullet"/>
       </w:pPr>
       <w:r>
-        <w:t>Raise percid removal to realistic total levels — higher F representing recreational + unreported small-scale coastal catch (Section 3.2).</w:t>
+        <w:t>SECONDARY (optional): improve cod PERSISTENCE (min 2.4 kt), not its level, via a credible forced-F trajectory + pinned M — skipped if a pre-run check shows cod is fine.</w:t>
       </w:r>
     </w:p>
     <w:p>
@@ -658,12 +658,20 @@
         <w:pStyle w:val="ListBullet"/>
       </w:pPr>
       <w:r>
-        <w:t>Calibrate seal/cormorant top-down control (biomass + ingestion rate) to absorb the forage fish that lower cod releases and to add the perch/young-pikeperch predation that is ~2× the fishery (Section 3.3).</w:t>
+        <w:t>DROPPED: seal predation on forage fish (no gap — forage prey already in-envelope).</w:t>
+      </w:r>
+    </w:p>
+    <w:p>
+      <w:pPr>
+        <w:pStyle w:val="ListBullet"/>
+      </w:pPr>
+      <w:r>
+        <w:t>A mandatory cheap feasibility gate (one hand-cranked forward sim) precedes the 4–8 h re-calibration, so a structural wall is found in minutes, not hours (the mistake the disaggregation made).</w:t>
       </w:r>
     </w:p>
     <w:p>
       <w:r>
-        <w:t>Success bar (honest, structural): cod near its real depressed trajectory; prey species no worse than the 5/8 baseline; percids improved toward their envelopes without destabilising the high-weight stocks.</w:t>
+        <w:t>Success bar (pre-registered): perch/smelt reduced by a stated numeric threshold; every high-weight prey stays in its baseline envelope; realized cormorant consumption checked against the Hansson budget; residual pikeperch overshoot credited as structural ONLY after an insensitivity test; a pre-registered revert rule.</w:t>
       </w:r>
     </w:p>
     <w:p>

</xml_diff>